<commit_message>
fix(onboarding-content): update onboarding flow document with new content
</commit_message>
<xml_diff>
--- a/public/PDFVault - Onboarding Flow Content.docx
+++ b/public/PDFVault - Onboarding Flow Content.docx
@@ -1,6 +1,6 @@
 
 <file path=word/document.xml><?xml version="1.0" encoding="utf-8"?>
-<w:document xmlns:wpc="http://schemas.microsoft.com/office/word/2010/wordprocessingCanvas" xmlns:cx="http://schemas.microsoft.com/office/drawing/2014/chartex" xmlns:cx1="http://schemas.microsoft.com/office/drawing/2015/9/8/chartex" xmlns:cx2="http://schemas.microsoft.com/office/drawing/2015/10/21/chartex" xmlns:cx3="http://schemas.microsoft.com/office/drawing/2016/5/9/chartex" xmlns:cx4="http://schemas.microsoft.com/office/drawing/2016/5/10/chartex" xmlns:cx5="http://schemas.microsoft.com/office/drawing/2016/5/11/chartex" xmlns:cx6="http://schemas.microsoft.com/office/drawing/2016/5/12/chartex" xmlns:cx7="http://schemas.microsoft.com/office/drawing/2016/5/13/chartex" xmlns:cx8="http://schemas.microsoft.com/office/drawing/2016/5/14/chartex" xmlns:mc="http://schemas.openxmlformats.org/markup-compatibility/2006" xmlns:m="http://schemas.openxmlformats.org/officeDocument/2006/math" xmlns:aink="http://schemas.microsoft.com/office/drawing/2016/ink" xmlns:am3d="http://schemas.microsoft.com/office/drawing/2017/model3d" xmlns:oel="http://schemas.microsoft.com/office/2019/extlst" xmlns:r="http://schemas.openxmlformats.org/officeDocument/2006/relationships" xmlns:wp14="http://schemas.microsoft.com/office/word/2010/wordprocessingDrawing" xmlns:wp="http://schemas.openxmlformats.org/drawingml/2006/wordprocessingDrawing" xmlns:wpg="http://schemas.microsoft.com/office/word/2010/wordprocessingGroup" xmlns:wpi="http://schemas.microsoft.com/office/word/2010/wordprocessingInk" xmlns:wps="http://schemas.microsoft.com/office/word/2010/wordprocessingShape" xmlns:o="urn:schemas-microsoft-com:office:office" xmlns:v="urn:schemas-microsoft-com:vml" xmlns:w10="urn:schemas-microsoft-com:office:word" xmlns:w="http://schemas.openxmlformats.org/wordprocessingml/2006/main" xmlns:w14="http://schemas.microsoft.com/office/word/2010/wordml" xmlns:w15="http://schemas.microsoft.com/office/word/2012/wordml" xmlns:w16cei="http://schemas.microsoft.com/office/word/2026/wordml/cei" xmlns:w16cex="http://schemas.microsoft.com/office/word/2018/wordml/cex" xmlns:w16cid="http://schemas.microsoft.com/office/word/2016/wordml/cid" xmlns:w16="http://schemas.microsoft.com/office/word/2018/wordml" xmlns:w16sdtdh="http://schemas.microsoft.com/office/word/2020/wordml/sdtdatahash" xmlns:w16sdtfl="http://schemas.microsoft.com/office/word/2024/wordml/sdtformatlock" xmlns:w16se="http://schemas.microsoft.com/office/word/2015/wordml/symex" xmlns:w16du="http://schemas.microsoft.com/office/word/2023/wordml/word16du" xmlns:wne="http://schemas.microsoft.com/office/word/2006/wordml" mc:Ignorable="w14 w15 w16se w16cid w16 w16cex w16sdtdh w16sdtfl w16du wp14">
+<w:document xmlns:wpc="http://schemas.microsoft.com/office/word/2010/wordprocessingCanvas" xmlns:cx="http://schemas.microsoft.com/office/drawing/2014/chartex" xmlns:cx1="http://schemas.microsoft.com/office/drawing/2015/9/8/chartex" xmlns:cx2="http://schemas.microsoft.com/office/drawing/2015/10/21/chartex" xmlns:cx3="http://schemas.microsoft.com/office/drawing/2016/5/9/chartex" xmlns:cx4="http://schemas.microsoft.com/office/drawing/2016/5/10/chartex" xmlns:cx5="http://schemas.microsoft.com/office/drawing/2016/5/11/chartex" xmlns:cx6="http://schemas.microsoft.com/office/drawing/2016/5/12/chartex" xmlns:cx7="http://schemas.microsoft.com/office/drawing/2016/5/13/chartex" xmlns:cx8="http://schemas.microsoft.com/office/drawing/2016/5/14/chartex" xmlns:mc="http://schemas.openxmlformats.org/markup-compatibility/2006" xmlns:aink="http://schemas.microsoft.com/office/drawing/2016/ink" xmlns:am3d="http://schemas.microsoft.com/office/drawing/2017/model3d" xmlns:o="urn:schemas-microsoft-com:office:office" xmlns:oel="http://schemas.microsoft.com/office/2019/extlst" xmlns:r="http://schemas.openxmlformats.org/officeDocument/2006/relationships" xmlns:m="http://schemas.openxmlformats.org/officeDocument/2006/math" xmlns:v="urn:schemas-microsoft-com:vml" xmlns:wp14="http://schemas.microsoft.com/office/word/2010/wordprocessingDrawing" xmlns:wp="http://schemas.openxmlformats.org/drawingml/2006/wordprocessingDrawing" xmlns:w10="urn:schemas-microsoft-com:office:word" xmlns:w="http://schemas.openxmlformats.org/wordprocessingml/2006/main" xmlns:w14="http://schemas.microsoft.com/office/word/2010/wordml" xmlns:w15="http://schemas.microsoft.com/office/word/2012/wordml" xmlns:w16cex="http://schemas.microsoft.com/office/word/2018/wordml/cex" xmlns:w16cid="http://schemas.microsoft.com/office/word/2016/wordml/cid" xmlns:w16="http://schemas.microsoft.com/office/word/2018/wordml" xmlns:w16du="http://schemas.microsoft.com/office/word/2023/wordml/word16du" xmlns:w16sdtdh="http://schemas.microsoft.com/office/word/2020/wordml/sdtdatahash" xmlns:w16sdtfl="http://schemas.microsoft.com/office/word/2024/wordml/sdtformatlock" xmlns:w16se="http://schemas.microsoft.com/office/word/2015/wordml/symex" xmlns:wpg="http://schemas.microsoft.com/office/word/2010/wordprocessingGroup" xmlns:wpi="http://schemas.microsoft.com/office/word/2010/wordprocessingInk" xmlns:wne="http://schemas.microsoft.com/office/word/2006/wordml" xmlns:wps="http://schemas.microsoft.com/office/word/2010/wordprocessingShape" mc:Ignorable="w14 w15 w16se w16cid w16 w16cex w16sdtdh w16sdtfl w16du wp14">
   <w:body>
     <w:p>
       <w:pPr>
@@ -99,7 +99,7 @@
                 <w:sz w:val="21"/>
                 <w:szCs w:val="21"/>
               </w:rPr>
-              <w:t>By continuing, you agree you will be charged $0.99 today for a 7-day trial and $25 automatically every 30 days thereafter unless you cancel before your trial ends. You can cancel auto-renewing charges through your online account, or by emailing payments@pdfvault.ai before your next monthly renewal date. Prices may change. See our Subscription Terms and Refund Policy for full details.</w:t>
+              <w:t>By continuing, you agree you will be charged $0.99 today for a 7-day trial and $25 automatically every month thereafter unless you cancel before your trial ends. You can cancel auto-renewing charges through your online account, or by emailing support@pdfvault.ai before your next monthly renewal date. Prices may change. See our Subscription Terms and Refund Policy for full details.</w:t>
             </w:r>
           </w:p>
         </w:tc>
@@ -195,26 +195,36 @@
                 <w:sz w:val="24"/>
                 <w:szCs w:val="24"/>
               </w:rPr>
-              <w:t xml:space="preserve">INTERNAL </w:t>
+              <w:t xml:space="preserve">INTERNAL NOTE: </w:t>
             </w:r>
             <w:r>
               <w:rPr>
-                <w:b/>
-                <w:bCs/>
+                <w:rFonts w:eastAsia="Times New Roman"/>
                 <w:color w:val="FFFFFF" w:themeColor="background1"/>
                 <w:sz w:val="24"/>
                 <w:szCs w:val="24"/>
               </w:rPr>
-              <w:t xml:space="preserve">NOTE: </w:t>
+              <w:t xml:space="preserve">To legally protect our business, we must get the user's explicit consent </w:t>
             </w:r>
             <w:r>
               <w:rPr>
                 <w:rFonts w:eastAsia="Times New Roman"/>
+                <w:i/>
+                <w:iCs/>
                 <w:color w:val="FFFFFF" w:themeColor="background1"/>
                 <w:sz w:val="24"/>
                 <w:szCs w:val="24"/>
               </w:rPr>
-              <w:t xml:space="preserve">To legally protect our business under the </w:t>
+              <w:t>before</w:t>
+            </w:r>
+            <w:r>
+              <w:rPr>
+                <w:rFonts w:eastAsia="Times New Roman"/>
+                <w:color w:val="FFFFFF" w:themeColor="background1"/>
+                <w:sz w:val="24"/>
+                <w:szCs w:val="24"/>
+              </w:rPr>
+              <w:t xml:space="preserve"> they download or use the digital PDF tool. This is required under </w:t>
             </w:r>
             <w:r>
               <w:rPr>
@@ -225,7 +235,7 @@
                 <w:sz w:val="24"/>
                 <w:szCs w:val="24"/>
               </w:rPr>
-              <w:t>UK Consumer Contracts Regulations 2013 (Regulation 37)</w:t>
+              <w:t xml:space="preserve">UAE Consumer Protection Law </w:t>
             </w:r>
             <w:r>
               <w:rPr>
@@ -234,7 +244,16 @@
                 <w:sz w:val="24"/>
                 <w:szCs w:val="24"/>
               </w:rPr>
-              <w:t xml:space="preserve"> and </w:t>
+              <w:t>and</w:t>
+            </w:r>
+            <w:r>
+              <w:rPr>
+                <w:rFonts w:eastAsia="Times New Roman"/>
+                <w:color w:val="FFFFFF" w:themeColor="background1"/>
+                <w:sz w:val="24"/>
+                <w:szCs w:val="24"/>
+              </w:rPr>
+              <w:t xml:space="preserve">, for customers based in the UK or EU specifically, under the </w:t>
             </w:r>
             <w:r>
               <w:rPr>
@@ -245,6 +264,26 @@
                 <w:sz w:val="24"/>
                 <w:szCs w:val="24"/>
               </w:rPr>
+              <w:t xml:space="preserve">UK Consumer Contracts Regulations 2013 </w:t>
+            </w:r>
+            <w:r>
+              <w:rPr>
+                <w:rFonts w:eastAsia="Times New Roman"/>
+                <w:color w:val="FFFFFF" w:themeColor="background1"/>
+                <w:sz w:val="24"/>
+                <w:szCs w:val="24"/>
+              </w:rPr>
+              <w:t xml:space="preserve">and </w:t>
+            </w:r>
+            <w:r>
+              <w:rPr>
+                <w:rFonts w:eastAsia="Times New Roman"/>
+                <w:b/>
+                <w:bCs/>
+                <w:color w:val="FFFFFF" w:themeColor="background1"/>
+                <w:sz w:val="24"/>
+                <w:szCs w:val="24"/>
+              </w:rPr>
               <w:t>EU Consumer Rights Directive</w:t>
             </w:r>
             <w:r>
@@ -254,27 +293,7 @@
                 <w:sz w:val="24"/>
                 <w:szCs w:val="24"/>
               </w:rPr>
-              <w:t xml:space="preserve">, we must get the user's explicit consent </w:t>
-            </w:r>
-            <w:r>
-              <w:rPr>
-                <w:rFonts w:eastAsia="Times New Roman"/>
-                <w:i/>
-                <w:iCs/>
-                <w:color w:val="FFFFFF" w:themeColor="background1"/>
-                <w:sz w:val="24"/>
-                <w:szCs w:val="24"/>
-              </w:rPr>
-              <w:t>before</w:t>
-            </w:r>
-            <w:r>
-              <w:rPr>
-                <w:rFonts w:eastAsia="Times New Roman"/>
-                <w:color w:val="FFFFFF" w:themeColor="background1"/>
-                <w:sz w:val="24"/>
-                <w:szCs w:val="24"/>
-              </w:rPr>
-              <w:t xml:space="preserve"> they download or use the digital PDF tool. (If we do this, we can do away with Point 4 in the Refund Policy - Country Specific check box only)</w:t>
+              <w:t>. (This checkbox obtains consent to early performance — it does not remove the need to disclose the right of withdrawal itself, which stays in the Refund Policy.)</w:t>
             </w:r>
             <w:r>
               <w:rPr>
@@ -373,7 +392,7 @@
                 <w:sz w:val="24"/>
                 <w:szCs w:val="24"/>
               </w:rPr>
-              <w:t>[ ] I consent to immediate access to the [Company Name] premium digital tools and acknowledge that I will lose my 14-day statutory right to cancel and receive a refund once I download software, convert, or edit a PDF file.</w:t>
+              <w:t>[ ] I consent to immediate access to the [Company Name] premium digital tools before my 14-day statutory cancellation period ends. My right to a refund in this situation is governed by our Refund Policy.</w:t>
             </w:r>
             <w:r>
               <w:rPr>
@@ -445,7 +464,25 @@
                 <w:sz w:val="24"/>
                 <w:szCs w:val="24"/>
               </w:rPr>
-              <w:t>By clicking "Subscribe", you request immediate performance of this digital contract. If you begin using the PDFVault.ai tools within the 14-day cooling-off period, you waive your right to a full refund under UK/EU consumer laws.</w:t>
+              <w:t>By clicking "Subscribe", you request immediate performance of this digital contract. Starting to use the PDFVault.ai tools within the 14-day cooling-off period may affect your right to a refund</w:t>
+            </w:r>
+            <w:r>
+              <w:rPr>
+                <w:rFonts w:eastAsia="Times New Roman"/>
+                <w:color w:val="FFFFFF" w:themeColor="background1"/>
+                <w:sz w:val="24"/>
+                <w:szCs w:val="24"/>
+              </w:rPr>
+              <w:t>; please</w:t>
+            </w:r>
+            <w:r>
+              <w:rPr>
+                <w:rFonts w:eastAsia="Times New Roman"/>
+                <w:color w:val="FFFFFF" w:themeColor="background1"/>
+                <w:sz w:val="24"/>
+                <w:szCs w:val="24"/>
+              </w:rPr>
+              <w:t xml:space="preserve"> see our Refund Policy for details.</w:t>
             </w:r>
             <w:r>
               <w:rPr>
@@ -499,6 +536,7 @@
           <w:b/>
           <w:bCs/>
         </w:rPr>
+        <w:lastRenderedPageBreak/>
         <w:t xml:space="preserve">Subject: </w:t>
       </w:r>
       <w:r>
@@ -514,7 +552,6 @@
           <w:b/>
           <w:bCs/>
         </w:rPr>
-        <w:lastRenderedPageBreak/>
         <w:t xml:space="preserve">Preheader: </w:t>
       </w:r>
       <w:r>
@@ -608,7 +645,7 @@
           <w:rPr>
             <w:rStyle w:val="Hyperlink"/>
           </w:rPr>
-          <w:t>payments@pdfvault.ai</w:t>
+          <w:t>support@pdfvault.ai</w:t>
         </w:r>
       </w:hyperlink>
       <w:r>
@@ -697,7 +734,7 @@
         <w:spacing w:after="160"/>
       </w:pPr>
       <w:r>
-        <w:t>Sent 2 days before the trial converts to a paid subscription, giving users a clear window to cancel.</w:t>
+        <w:t>Sent 2 days before the trial converts to a paid subscription, giving users a clear window to cancel. [FLAG: confirm 2-day notice meets minimum auto-renewal notice laws in applicable US states.]</w:t>
       </w:r>
     </w:p>
     <w:p>
@@ -766,7 +803,7 @@
           <w:rPr>
             <w:rStyle w:val="Hyperlink"/>
           </w:rPr>
-          <w:t>payments@pdfvault.ai</w:t>
+          <w:t>support@pdfvault.ai</w:t>
         </w:r>
       </w:hyperlink>
       <w:r>
@@ -867,6 +904,7 @@
           <w:b/>
           <w:bCs/>
         </w:rPr>
+        <w:lastRenderedPageBreak/>
         <w:t xml:space="preserve">Subject: </w:t>
       </w:r>
       <w:r>
@@ -893,7 +931,6 @@
         <w:spacing w:after="160"/>
       </w:pPr>
       <w:r>
-        <w:lastRenderedPageBreak/>
         <w:t>Hi {{first_name}},</w:t>
       </w:r>
     </w:p>
@@ -1091,7 +1128,7 @@
         <w:spacing w:after="160"/>
       </w:pPr>
       <w:r>
-        <w:t>You'll keep full access to your premium features until {{access_end_date}}, the end of your current billing period. After that, your account will move to the free plan, and any saved files in your vault will remain accessible.</w:t>
+        <w:t>You'll keep full access to your premium features until {{access_end_date}}, the end of your current billing period. After that, your account will move to the free plan, and any saved files in your vault will remain accessible. [FLAG: free plan isn't described in the Subscription Terms — add a cross-reference.]</w:t>
       </w:r>
     </w:p>
     <w:p>
@@ -1230,6 +1267,7 @@
         <w:spacing w:after="160"/>
       </w:pPr>
       <w:r>
+        <w:lastRenderedPageBreak/>
         <w:t>Hi {{first_name}},</w:t>
       </w:r>
     </w:p>
@@ -1246,7 +1284,6 @@
         <w:spacing w:after="160"/>
       </w:pPr>
       <w:r>
-        <w:lastRenderedPageBreak/>
         <w:t>Here's what happens next:</w:t>
       </w:r>
     </w:p>
@@ -1514,7 +1551,7 @@
 </file>
 
 <file path=word/endnotes.xml><?xml version="1.0" encoding="utf-8"?>
-<w:endnotes xmlns:wpc="http://schemas.microsoft.com/office/word/2010/wordprocessingCanvas" xmlns:cx="http://schemas.microsoft.com/office/drawing/2014/chartex" xmlns:cx1="http://schemas.microsoft.com/office/drawing/2015/9/8/chartex" xmlns:cx2="http://schemas.microsoft.com/office/drawing/2015/10/21/chartex" xmlns:cx3="http://schemas.microsoft.com/office/drawing/2016/5/9/chartex" xmlns:cx4="http://schemas.microsoft.com/office/drawing/2016/5/10/chartex" xmlns:cx5="http://schemas.microsoft.com/office/drawing/2016/5/11/chartex" xmlns:cx6="http://schemas.microsoft.com/office/drawing/2016/5/12/chartex" xmlns:cx7="http://schemas.microsoft.com/office/drawing/2016/5/13/chartex" xmlns:cx8="http://schemas.microsoft.com/office/drawing/2016/5/14/chartex" xmlns:mc="http://schemas.openxmlformats.org/markup-compatibility/2006" xmlns:m="http://schemas.openxmlformats.org/officeDocument/2006/math" xmlns:aink="http://schemas.microsoft.com/office/drawing/2016/ink" xmlns:am3d="http://schemas.microsoft.com/office/drawing/2017/model3d" xmlns:oel="http://schemas.microsoft.com/office/2019/extlst" xmlns:r="http://schemas.openxmlformats.org/officeDocument/2006/relationships" xmlns:wp14="http://schemas.microsoft.com/office/word/2010/wordprocessingDrawing" xmlns:wp="http://schemas.openxmlformats.org/drawingml/2006/wordprocessingDrawing" xmlns:wpg="http://schemas.microsoft.com/office/word/2010/wordprocessingGroup" xmlns:wpi="http://schemas.microsoft.com/office/word/2010/wordprocessingInk" xmlns:wps="http://schemas.microsoft.com/office/word/2010/wordprocessingShape" xmlns:o="urn:schemas-microsoft-com:office:office" xmlns:v="urn:schemas-microsoft-com:vml" xmlns:w10="urn:schemas-microsoft-com:office:word" xmlns:w="http://schemas.openxmlformats.org/wordprocessingml/2006/main" xmlns:w14="http://schemas.microsoft.com/office/word/2010/wordml" xmlns:w15="http://schemas.microsoft.com/office/word/2012/wordml" xmlns:w16cei="http://schemas.microsoft.com/office/word/2026/wordml/cei" xmlns:w16cex="http://schemas.microsoft.com/office/word/2018/wordml/cex" xmlns:w16cid="http://schemas.microsoft.com/office/word/2016/wordml/cid" xmlns:w16="http://schemas.microsoft.com/office/word/2018/wordml" xmlns:w16sdtdh="http://schemas.microsoft.com/office/word/2020/wordml/sdtdatahash" xmlns:w16sdtfl="http://schemas.microsoft.com/office/word/2024/wordml/sdtformatlock" xmlns:w16se="http://schemas.microsoft.com/office/word/2015/wordml/symex" xmlns:w16du="http://schemas.microsoft.com/office/word/2023/wordml/word16du" xmlns:wne="http://schemas.microsoft.com/office/word/2006/wordml" mc:Ignorable="w14 w15 w16se w16cid w16 w16cex w16sdtdh w16sdtfl w16du wp14">
+<w:endnotes xmlns:wpc="http://schemas.microsoft.com/office/word/2010/wordprocessingCanvas" xmlns:cx="http://schemas.microsoft.com/office/drawing/2014/chartex" xmlns:cx1="http://schemas.microsoft.com/office/drawing/2015/9/8/chartex" xmlns:cx2="http://schemas.microsoft.com/office/drawing/2015/10/21/chartex" xmlns:cx3="http://schemas.microsoft.com/office/drawing/2016/5/9/chartex" xmlns:cx4="http://schemas.microsoft.com/office/drawing/2016/5/10/chartex" xmlns:cx5="http://schemas.microsoft.com/office/drawing/2016/5/11/chartex" xmlns:cx6="http://schemas.microsoft.com/office/drawing/2016/5/12/chartex" xmlns:cx7="http://schemas.microsoft.com/office/drawing/2016/5/13/chartex" xmlns:cx8="http://schemas.microsoft.com/office/drawing/2016/5/14/chartex" xmlns:mc="http://schemas.openxmlformats.org/markup-compatibility/2006" xmlns:aink="http://schemas.microsoft.com/office/drawing/2016/ink" xmlns:am3d="http://schemas.microsoft.com/office/drawing/2017/model3d" xmlns:o="urn:schemas-microsoft-com:office:office" xmlns:oel="http://schemas.microsoft.com/office/2019/extlst" xmlns:r="http://schemas.openxmlformats.org/officeDocument/2006/relationships" xmlns:m="http://schemas.openxmlformats.org/officeDocument/2006/math" xmlns:v="urn:schemas-microsoft-com:vml" xmlns:wp14="http://schemas.microsoft.com/office/word/2010/wordprocessingDrawing" xmlns:wp="http://schemas.openxmlformats.org/drawingml/2006/wordprocessingDrawing" xmlns:w10="urn:schemas-microsoft-com:office:word" xmlns:w="http://schemas.openxmlformats.org/wordprocessingml/2006/main" xmlns:w14="http://schemas.microsoft.com/office/word/2010/wordml" xmlns:w15="http://schemas.microsoft.com/office/word/2012/wordml" xmlns:w16cex="http://schemas.microsoft.com/office/word/2018/wordml/cex" xmlns:w16cid="http://schemas.microsoft.com/office/word/2016/wordml/cid" xmlns:w16="http://schemas.microsoft.com/office/word/2018/wordml" xmlns:w16du="http://schemas.microsoft.com/office/word/2023/wordml/word16du" xmlns:w16sdtdh="http://schemas.microsoft.com/office/word/2020/wordml/sdtdatahash" xmlns:w16sdtfl="http://schemas.microsoft.com/office/word/2024/wordml/sdtformatlock" xmlns:w16se="http://schemas.microsoft.com/office/word/2015/wordml/symex" xmlns:wpg="http://schemas.microsoft.com/office/word/2010/wordprocessingGroup" xmlns:wpi="http://schemas.microsoft.com/office/word/2010/wordprocessingInk" xmlns:wne="http://schemas.microsoft.com/office/word/2006/wordml" xmlns:wps="http://schemas.microsoft.com/office/word/2010/wordprocessingShape" mc:Ignorable="w14 w15 w16se w16cid w16 w16cex w16sdtdh w16sdtfl w16du wp14">
   <w:endnote w:type="separator" w:id="-1">
     <w:p>
       <w:r>
@@ -1533,7 +1570,7 @@
 </file>
 
 <file path=word/footer1.xml><?xml version="1.0" encoding="utf-8"?>
-<w:ftr xmlns:wpc="http://schemas.microsoft.com/office/word/2010/wordprocessingCanvas" xmlns:cx="http://schemas.microsoft.com/office/drawing/2014/chartex" xmlns:cx1="http://schemas.microsoft.com/office/drawing/2015/9/8/chartex" xmlns:cx2="http://schemas.microsoft.com/office/drawing/2015/10/21/chartex" xmlns:cx3="http://schemas.microsoft.com/office/drawing/2016/5/9/chartex" xmlns:cx4="http://schemas.microsoft.com/office/drawing/2016/5/10/chartex" xmlns:cx5="http://schemas.microsoft.com/office/drawing/2016/5/11/chartex" xmlns:cx6="http://schemas.microsoft.com/office/drawing/2016/5/12/chartex" xmlns:cx7="http://schemas.microsoft.com/office/drawing/2016/5/13/chartex" xmlns:cx8="http://schemas.microsoft.com/office/drawing/2016/5/14/chartex" xmlns:mc="http://schemas.openxmlformats.org/markup-compatibility/2006" xmlns:m="http://schemas.openxmlformats.org/officeDocument/2006/math" xmlns:aink="http://schemas.microsoft.com/office/drawing/2016/ink" xmlns:am3d="http://schemas.microsoft.com/office/drawing/2017/model3d" xmlns:oel="http://schemas.microsoft.com/office/2019/extlst" xmlns:r="http://schemas.openxmlformats.org/officeDocument/2006/relationships" xmlns:wp14="http://schemas.microsoft.com/office/word/2010/wordprocessingDrawing" xmlns:wp="http://schemas.openxmlformats.org/drawingml/2006/wordprocessingDrawing" xmlns:wpg="http://schemas.microsoft.com/office/word/2010/wordprocessingGroup" xmlns:wpi="http://schemas.microsoft.com/office/word/2010/wordprocessingInk" xmlns:wps="http://schemas.microsoft.com/office/word/2010/wordprocessingShape" xmlns:o="urn:schemas-microsoft-com:office:office" xmlns:v="urn:schemas-microsoft-com:vml" xmlns:w10="urn:schemas-microsoft-com:office:word" xmlns:w="http://schemas.openxmlformats.org/wordprocessingml/2006/main" xmlns:w14="http://schemas.microsoft.com/office/word/2010/wordml" xmlns:w15="http://schemas.microsoft.com/office/word/2012/wordml" xmlns:w16cei="http://schemas.microsoft.com/office/word/2026/wordml/cei" xmlns:w16cex="http://schemas.microsoft.com/office/word/2018/wordml/cex" xmlns:w16cid="http://schemas.microsoft.com/office/word/2016/wordml/cid" xmlns:w16="http://schemas.microsoft.com/office/word/2018/wordml" xmlns:w16sdtdh="http://schemas.microsoft.com/office/word/2020/wordml/sdtdatahash" xmlns:w16sdtfl="http://schemas.microsoft.com/office/word/2024/wordml/sdtformatlock" xmlns:w16se="http://schemas.microsoft.com/office/word/2015/wordml/symex" xmlns:w16du="http://schemas.microsoft.com/office/word/2023/wordml/word16du" xmlns:wne="http://schemas.microsoft.com/office/word/2006/wordml" mc:Ignorable="w14 w15 w16se w16cid w16 w16cex w16sdtdh w16sdtfl w16du wp14">
+<w:ftr xmlns:wpc="http://schemas.microsoft.com/office/word/2010/wordprocessingCanvas" xmlns:cx="http://schemas.microsoft.com/office/drawing/2014/chartex" xmlns:cx1="http://schemas.microsoft.com/office/drawing/2015/9/8/chartex" xmlns:cx2="http://schemas.microsoft.com/office/drawing/2015/10/21/chartex" xmlns:cx3="http://schemas.microsoft.com/office/drawing/2016/5/9/chartex" xmlns:cx4="http://schemas.microsoft.com/office/drawing/2016/5/10/chartex" xmlns:cx5="http://schemas.microsoft.com/office/drawing/2016/5/11/chartex" xmlns:cx6="http://schemas.microsoft.com/office/drawing/2016/5/12/chartex" xmlns:cx7="http://schemas.microsoft.com/office/drawing/2016/5/13/chartex" xmlns:cx8="http://schemas.microsoft.com/office/drawing/2016/5/14/chartex" xmlns:mc="http://schemas.openxmlformats.org/markup-compatibility/2006" xmlns:aink="http://schemas.microsoft.com/office/drawing/2016/ink" xmlns:am3d="http://schemas.microsoft.com/office/drawing/2017/model3d" xmlns:o="urn:schemas-microsoft-com:office:office" xmlns:oel="http://schemas.microsoft.com/office/2019/extlst" xmlns:r="http://schemas.openxmlformats.org/officeDocument/2006/relationships" xmlns:m="http://schemas.openxmlformats.org/officeDocument/2006/math" xmlns:v="urn:schemas-microsoft-com:vml" xmlns:wp14="http://schemas.microsoft.com/office/word/2010/wordprocessingDrawing" xmlns:wp="http://schemas.openxmlformats.org/drawingml/2006/wordprocessingDrawing" xmlns:w10="urn:schemas-microsoft-com:office:word" xmlns:w="http://schemas.openxmlformats.org/wordprocessingml/2006/main" xmlns:w14="http://schemas.microsoft.com/office/word/2010/wordml" xmlns:w15="http://schemas.microsoft.com/office/word/2012/wordml" xmlns:w16cex="http://schemas.microsoft.com/office/word/2018/wordml/cex" xmlns:w16cid="http://schemas.microsoft.com/office/word/2016/wordml/cid" xmlns:w16="http://schemas.microsoft.com/office/word/2018/wordml" xmlns:w16du="http://schemas.microsoft.com/office/word/2023/wordml/word16du" xmlns:w16sdtdh="http://schemas.microsoft.com/office/word/2020/wordml/sdtdatahash" xmlns:w16sdtfl="http://schemas.microsoft.com/office/word/2024/wordml/sdtformatlock" xmlns:w16se="http://schemas.microsoft.com/office/word/2015/wordml/symex" xmlns:wpg="http://schemas.microsoft.com/office/word/2010/wordprocessingGroup" xmlns:wpi="http://schemas.microsoft.com/office/word/2010/wordprocessingInk" xmlns:wne="http://schemas.microsoft.com/office/word/2006/wordml" xmlns:wps="http://schemas.microsoft.com/office/word/2010/wordprocessingShape" mc:Ignorable="w14 w15 w16se w16cid w16 w16cex w16sdtdh w16sdtfl w16du wp14">
   <w:p>
     <w:pPr>
       <w:pBdr>
@@ -1554,7 +1591,7 @@
 </file>
 
 <file path=word/footnotes.xml><?xml version="1.0" encoding="utf-8"?>
-<w:footnotes xmlns:wpc="http://schemas.microsoft.com/office/word/2010/wordprocessingCanvas" xmlns:cx="http://schemas.microsoft.com/office/drawing/2014/chartex" xmlns:cx1="http://schemas.microsoft.com/office/drawing/2015/9/8/chartex" xmlns:cx2="http://schemas.microsoft.com/office/drawing/2015/10/21/chartex" xmlns:cx3="http://schemas.microsoft.com/office/drawing/2016/5/9/chartex" xmlns:cx4="http://schemas.microsoft.com/office/drawing/2016/5/10/chartex" xmlns:cx5="http://schemas.microsoft.com/office/drawing/2016/5/11/chartex" xmlns:cx6="http://schemas.microsoft.com/office/drawing/2016/5/12/chartex" xmlns:cx7="http://schemas.microsoft.com/office/drawing/2016/5/13/chartex" xmlns:cx8="http://schemas.microsoft.com/office/drawing/2016/5/14/chartex" xmlns:mc="http://schemas.openxmlformats.org/markup-compatibility/2006" xmlns:m="http://schemas.openxmlformats.org/officeDocument/2006/math" xmlns:aink="http://schemas.microsoft.com/office/drawing/2016/ink" xmlns:am3d="http://schemas.microsoft.com/office/drawing/2017/model3d" xmlns:oel="http://schemas.microsoft.com/office/2019/extlst" xmlns:r="http://schemas.openxmlformats.org/officeDocument/2006/relationships" xmlns:wp14="http://schemas.microsoft.com/office/word/2010/wordprocessingDrawing" xmlns:wp="http://schemas.openxmlformats.org/drawingml/2006/wordprocessingDrawing" xmlns:wpg="http://schemas.microsoft.com/office/word/2010/wordprocessingGroup" xmlns:wpi="http://schemas.microsoft.com/office/word/2010/wordprocessingInk" xmlns:wps="http://schemas.microsoft.com/office/word/2010/wordprocessingShape" xmlns:o="urn:schemas-microsoft-com:office:office" xmlns:v="urn:schemas-microsoft-com:vml" xmlns:w10="urn:schemas-microsoft-com:office:word" xmlns:w="http://schemas.openxmlformats.org/wordprocessingml/2006/main" xmlns:w14="http://schemas.microsoft.com/office/word/2010/wordml" xmlns:w15="http://schemas.microsoft.com/office/word/2012/wordml" xmlns:w16cei="http://schemas.microsoft.com/office/word/2026/wordml/cei" xmlns:w16cex="http://schemas.microsoft.com/office/word/2018/wordml/cex" xmlns:w16cid="http://schemas.microsoft.com/office/word/2016/wordml/cid" xmlns:w16="http://schemas.microsoft.com/office/word/2018/wordml" xmlns:w16sdtdh="http://schemas.microsoft.com/office/word/2020/wordml/sdtdatahash" xmlns:w16sdtfl="http://schemas.microsoft.com/office/word/2024/wordml/sdtformatlock" xmlns:w16se="http://schemas.microsoft.com/office/word/2015/wordml/symex" xmlns:w16du="http://schemas.microsoft.com/office/word/2023/wordml/word16du" xmlns:wne="http://schemas.microsoft.com/office/word/2006/wordml" mc:Ignorable="w14 w15 w16se w16cid w16 w16cex w16sdtdh w16sdtfl w16du wp14">
+<w:footnotes xmlns:wpc="http://schemas.microsoft.com/office/word/2010/wordprocessingCanvas" xmlns:cx="http://schemas.microsoft.com/office/drawing/2014/chartex" xmlns:cx1="http://schemas.microsoft.com/office/drawing/2015/9/8/chartex" xmlns:cx2="http://schemas.microsoft.com/office/drawing/2015/10/21/chartex" xmlns:cx3="http://schemas.microsoft.com/office/drawing/2016/5/9/chartex" xmlns:cx4="http://schemas.microsoft.com/office/drawing/2016/5/10/chartex" xmlns:cx5="http://schemas.microsoft.com/office/drawing/2016/5/11/chartex" xmlns:cx6="http://schemas.microsoft.com/office/drawing/2016/5/12/chartex" xmlns:cx7="http://schemas.microsoft.com/office/drawing/2016/5/13/chartex" xmlns:cx8="http://schemas.microsoft.com/office/drawing/2016/5/14/chartex" xmlns:mc="http://schemas.openxmlformats.org/markup-compatibility/2006" xmlns:aink="http://schemas.microsoft.com/office/drawing/2016/ink" xmlns:am3d="http://schemas.microsoft.com/office/drawing/2017/model3d" xmlns:o="urn:schemas-microsoft-com:office:office" xmlns:oel="http://schemas.microsoft.com/office/2019/extlst" xmlns:r="http://schemas.openxmlformats.org/officeDocument/2006/relationships" xmlns:m="http://schemas.openxmlformats.org/officeDocument/2006/math" xmlns:v="urn:schemas-microsoft-com:vml" xmlns:wp14="http://schemas.microsoft.com/office/word/2010/wordprocessingDrawing" xmlns:wp="http://schemas.openxmlformats.org/drawingml/2006/wordprocessingDrawing" xmlns:w10="urn:schemas-microsoft-com:office:word" xmlns:w="http://schemas.openxmlformats.org/wordprocessingml/2006/main" xmlns:w14="http://schemas.microsoft.com/office/word/2010/wordml" xmlns:w15="http://schemas.microsoft.com/office/word/2012/wordml" xmlns:w16cex="http://schemas.microsoft.com/office/word/2018/wordml/cex" xmlns:w16cid="http://schemas.microsoft.com/office/word/2016/wordml/cid" xmlns:w16="http://schemas.microsoft.com/office/word/2018/wordml" xmlns:w16du="http://schemas.microsoft.com/office/word/2023/wordml/word16du" xmlns:w16sdtdh="http://schemas.microsoft.com/office/word/2020/wordml/sdtdatahash" xmlns:w16sdtfl="http://schemas.microsoft.com/office/word/2024/wordml/sdtformatlock" xmlns:w16se="http://schemas.microsoft.com/office/word/2015/wordml/symex" xmlns:wpg="http://schemas.microsoft.com/office/word/2010/wordprocessingGroup" xmlns:wpi="http://schemas.microsoft.com/office/word/2010/wordprocessingInk" xmlns:wne="http://schemas.microsoft.com/office/word/2006/wordml" xmlns:wps="http://schemas.microsoft.com/office/word/2010/wordprocessingShape" mc:Ignorable="w14 w15 w16se w16cid w16 w16cex w16sdtdh w16sdtfl w16du wp14">
   <w:footnote w:type="separator" w:id="-1">
     <w:p>
       <w:r>
@@ -1573,7 +1610,7 @@
 </file>
 
 <file path=word/numbering.xml><?xml version="1.0" encoding="utf-8"?>
-<w:numbering xmlns:wpc="http://schemas.microsoft.com/office/word/2010/wordprocessingCanvas" xmlns:cx="http://schemas.microsoft.com/office/drawing/2014/chartex" xmlns:cx1="http://schemas.microsoft.com/office/drawing/2015/9/8/chartex" xmlns:cx2="http://schemas.microsoft.com/office/drawing/2015/10/21/chartex" xmlns:cx3="http://schemas.microsoft.com/office/drawing/2016/5/9/chartex" xmlns:cx4="http://schemas.microsoft.com/office/drawing/2016/5/10/chartex" xmlns:cx5="http://schemas.microsoft.com/office/drawing/2016/5/11/chartex" xmlns:cx6="http://schemas.microsoft.com/office/drawing/2016/5/12/chartex" xmlns:cx7="http://schemas.microsoft.com/office/drawing/2016/5/13/chartex" xmlns:cx8="http://schemas.microsoft.com/office/drawing/2016/5/14/chartex" xmlns:mc="http://schemas.openxmlformats.org/markup-compatibility/2006" xmlns:m="http://schemas.openxmlformats.org/officeDocument/2006/math" xmlns:aink="http://schemas.microsoft.com/office/drawing/2016/ink" xmlns:am3d="http://schemas.microsoft.com/office/drawing/2017/model3d" xmlns:oel="http://schemas.microsoft.com/office/2019/extlst" xmlns:r="http://schemas.openxmlformats.org/officeDocument/2006/relationships" xmlns:wp14="http://schemas.microsoft.com/office/word/2010/wordprocessingDrawing" xmlns:wp="http://schemas.openxmlformats.org/drawingml/2006/wordprocessingDrawing" xmlns:wpg="http://schemas.microsoft.com/office/word/2010/wordprocessingGroup" xmlns:wpi="http://schemas.microsoft.com/office/word/2010/wordprocessingInk" xmlns:wps="http://schemas.microsoft.com/office/word/2010/wordprocessingShape" xmlns:o="urn:schemas-microsoft-com:office:office" xmlns:v="urn:schemas-microsoft-com:vml" xmlns:w10="urn:schemas-microsoft-com:office:word" xmlns:w="http://schemas.openxmlformats.org/wordprocessingml/2006/main" xmlns:w14="http://schemas.microsoft.com/office/word/2010/wordml" xmlns:w15="http://schemas.microsoft.com/office/word/2012/wordml" xmlns:w16cei="http://schemas.microsoft.com/office/word/2026/wordml/cei" xmlns:w16cex="http://schemas.microsoft.com/office/word/2018/wordml/cex" xmlns:w16cid="http://schemas.microsoft.com/office/word/2016/wordml/cid" xmlns:w16="http://schemas.microsoft.com/office/word/2018/wordml" xmlns:w16sdtdh="http://schemas.microsoft.com/office/word/2020/wordml/sdtdatahash" xmlns:w16sdtfl="http://schemas.microsoft.com/office/word/2024/wordml/sdtformatlock" xmlns:w16se="http://schemas.microsoft.com/office/word/2015/wordml/symex" xmlns:w16du="http://schemas.microsoft.com/office/word/2023/wordml/word16du" xmlns:wne="http://schemas.microsoft.com/office/word/2006/wordml" mc:Ignorable="w14 w15 w16se w16cid w16 w16cex w16sdtdh w16sdtfl w16du wp14">
+<w:numbering xmlns:wpc="http://schemas.microsoft.com/office/word/2010/wordprocessingCanvas" xmlns:cx="http://schemas.microsoft.com/office/drawing/2014/chartex" xmlns:cx1="http://schemas.microsoft.com/office/drawing/2015/9/8/chartex" xmlns:cx2="http://schemas.microsoft.com/office/drawing/2015/10/21/chartex" xmlns:cx3="http://schemas.microsoft.com/office/drawing/2016/5/9/chartex" xmlns:cx4="http://schemas.microsoft.com/office/drawing/2016/5/10/chartex" xmlns:cx5="http://schemas.microsoft.com/office/drawing/2016/5/11/chartex" xmlns:cx6="http://schemas.microsoft.com/office/drawing/2016/5/12/chartex" xmlns:cx7="http://schemas.microsoft.com/office/drawing/2016/5/13/chartex" xmlns:cx8="http://schemas.microsoft.com/office/drawing/2016/5/14/chartex" xmlns:mc="http://schemas.openxmlformats.org/markup-compatibility/2006" xmlns:aink="http://schemas.microsoft.com/office/drawing/2016/ink" xmlns:am3d="http://schemas.microsoft.com/office/drawing/2017/model3d" xmlns:o="urn:schemas-microsoft-com:office:office" xmlns:oel="http://schemas.microsoft.com/office/2019/extlst" xmlns:r="http://schemas.openxmlformats.org/officeDocument/2006/relationships" xmlns:m="http://schemas.openxmlformats.org/officeDocument/2006/math" xmlns:v="urn:schemas-microsoft-com:vml" xmlns:wp14="http://schemas.microsoft.com/office/word/2010/wordprocessingDrawing" xmlns:wp="http://schemas.openxmlformats.org/drawingml/2006/wordprocessingDrawing" xmlns:w10="urn:schemas-microsoft-com:office:word" xmlns:w="http://schemas.openxmlformats.org/wordprocessingml/2006/main" xmlns:w14="http://schemas.microsoft.com/office/word/2010/wordml" xmlns:w15="http://schemas.microsoft.com/office/word/2012/wordml" xmlns:w16cex="http://schemas.microsoft.com/office/word/2018/wordml/cex" xmlns:w16cid="http://schemas.microsoft.com/office/word/2016/wordml/cid" xmlns:w16="http://schemas.microsoft.com/office/word/2018/wordml" xmlns:w16du="http://schemas.microsoft.com/office/word/2023/wordml/word16du" xmlns:w16sdtdh="http://schemas.microsoft.com/office/word/2020/wordml/sdtdatahash" xmlns:w16sdtfl="http://schemas.microsoft.com/office/word/2024/wordml/sdtformatlock" xmlns:w16se="http://schemas.microsoft.com/office/word/2015/wordml/symex" xmlns:wpg="http://schemas.microsoft.com/office/word/2010/wordprocessingGroup" xmlns:wpi="http://schemas.microsoft.com/office/word/2010/wordprocessingInk" xmlns:wne="http://schemas.microsoft.com/office/word/2006/wordml" xmlns:wps="http://schemas.microsoft.com/office/word/2010/wordprocessingShape" mc:Ignorable="w14 w15 w16se w16cid w16 w16cex w16sdtdh w16sdtfl w16du wp14">
   <w:abstractNum w:abstractNumId="0" w15:restartNumberingAfterBreak="0">
     <w:nsid w:val="38B531B9"/>
     <w:multiLevelType w:val="hybridMultilevel"/>
@@ -1638,7 +1675,7 @@
 </file>
 
 <file path=word/styles.xml><?xml version="1.0" encoding="utf-8"?>
-<w:styles xmlns:mc="http://schemas.openxmlformats.org/markup-compatibility/2006" xmlns:r="http://schemas.openxmlformats.org/officeDocument/2006/relationships" xmlns:w="http://schemas.openxmlformats.org/wordprocessingml/2006/main" xmlns:w14="http://schemas.microsoft.com/office/word/2010/wordml" xmlns:w15="http://schemas.microsoft.com/office/word/2012/wordml" xmlns:w16cex="http://schemas.microsoft.com/office/word/2018/wordml/cex" xmlns:w16cid="http://schemas.microsoft.com/office/word/2016/wordml/cid" xmlns:w16="http://schemas.microsoft.com/office/word/2018/wordml" xmlns:w16sdtdh="http://schemas.microsoft.com/office/word/2020/wordml/sdtdatahash" xmlns:w16sdtfl="http://schemas.microsoft.com/office/word/2024/wordml/sdtformatlock" xmlns:w16se="http://schemas.microsoft.com/office/word/2015/wordml/symex" xmlns:w16du="http://schemas.microsoft.com/office/word/2023/wordml/word16du" mc:Ignorable="w14 w15 w16se w16cid w16 w16cex w16sdtdh w16sdtfl w16du">
+<w:styles xmlns:mc="http://schemas.openxmlformats.org/markup-compatibility/2006" xmlns:r="http://schemas.openxmlformats.org/officeDocument/2006/relationships" xmlns:w="http://schemas.openxmlformats.org/wordprocessingml/2006/main" xmlns:w14="http://schemas.microsoft.com/office/word/2010/wordml" xmlns:w15="http://schemas.microsoft.com/office/word/2012/wordml" xmlns:w16cex="http://schemas.microsoft.com/office/word/2018/wordml/cex" xmlns:w16cid="http://schemas.microsoft.com/office/word/2016/wordml/cid" xmlns:w16="http://schemas.microsoft.com/office/word/2018/wordml" xmlns:w16du="http://schemas.microsoft.com/office/word/2023/wordml/word16du" xmlns:w16sdtdh="http://schemas.microsoft.com/office/word/2020/wordml/sdtdatahash" xmlns:w16sdtfl="http://schemas.microsoft.com/office/word/2024/wordml/sdtformatlock" xmlns:w16se="http://schemas.microsoft.com/office/word/2015/wordml/symex" mc:Ignorable="w14 w15 w16se w16cid w16 w16cex w16sdtdh w16sdtfl w16du">
   <w:docDefaults>
     <w:rPrDefault>
       <w:rPr>

</xml_diff>